<commit_message>
Entente : section 9 Frais juridiques (perdant rembourse les frais de l'Exploitant ; renonciation reciproque du Client a reclamer les siens), renumerotation 9->10, versions b, docx regenere
Co-Authored-By: Claude Fable 5 <noreply@anthropic.com>
</commit_message>
<xml_diff>
--- a/dossier-legal/entente-client-pionnier.docx
+++ b/dossier-legal/entente-client-pionnier.docx
@@ -787,7 +787,78 @@
           <w:sz w:val="26"/>
           <w:szCs w:val="26"/>
         </w:rPr>
-        <w:t xml:space="preserve">9. Dispositions générales</w:t>
+        <w:t xml:space="preserve">9. Frais juridiques</w:t>
+      </w:r>
+    </w:p>
+    <w:p>
+      <w:pPr>
+        <w:pStyle w:val="ListParagraph"/>
+        <w:numPr>
+          <w:ilvl w:val="0"/>
+          <w:numId w:val="2"/>
+        </w:numPr>
+        <w:spacing w:after="80" w:line="300"/>
+      </w:pPr>
+      <w:r>
+        <w:rPr>
+          <w:rFonts w:ascii="Calibri" w:cs="Calibri" w:eastAsia="Calibri" w:hAnsi="Calibri"/>
+          <w:sz w:val="22"/>
+          <w:szCs w:val="22"/>
+        </w:rPr>
+        <w:t xml:space="preserve">En cas de recours judiciaire, d'arbitrage ou de médiation relié à la présente entente, au Logiciel ou à leur exécution : si le Client pionnier succombe (jugement, sentence ou règlement défavorable, en tout ou pour l'essentiel), il rembourse à l'Exploitant la totalité des frais juridiques et extrajudiciaires raisonnablement engagés par celui-ci — honoraires d'avocats, frais d'experts, frais de médiation ou d'arbitrage et débours.</w:t>
+      </w:r>
+    </w:p>
+    <w:p>
+      <w:pPr>
+        <w:pStyle w:val="ListParagraph"/>
+        <w:numPr>
+          <w:ilvl w:val="0"/>
+          <w:numId w:val="2"/>
+        </w:numPr>
+        <w:spacing w:after="80" w:line="300"/>
+      </w:pPr>
+      <w:r>
+        <w:rPr>
+          <w:rFonts w:ascii="Calibri" w:cs="Calibri" w:eastAsia="Calibri" w:hAnsi="Calibri"/>
+          <w:sz w:val="22"/>
+          <w:szCs w:val="22"/>
+        </w:rPr>
+        <w:t xml:space="preserve">À l'inverse, si l'Exploitant succombe, chaque partie assume ses propres frais : le Client pionnier renonce à réclamer à l'Exploitant ses frais juridiques et extrajudiciaires, quelle que soit l'issue.</w:t>
+      </w:r>
+    </w:p>
+    <w:p>
+      <w:pPr>
+        <w:pStyle w:val="ListParagraph"/>
+        <w:numPr>
+          <w:ilvl w:val="0"/>
+          <w:numId w:val="2"/>
+        </w:numPr>
+        <w:spacing w:after="80" w:line="300"/>
+      </w:pPr>
+      <w:r>
+        <w:rPr>
+          <w:rFonts w:ascii="Calibri" w:cs="Calibri" w:eastAsia="Calibri" w:hAnsi="Calibri"/>
+          <w:sz w:val="22"/>
+          <w:szCs w:val="22"/>
+        </w:rPr>
+        <w:t xml:space="preserve">La présente clause survit à la fin de l'entente, quelle qu'en soit la cause.</w:t>
+      </w:r>
+    </w:p>
+    <w:p>
+      <w:pPr>
+        <w:pStyle w:val="Heading1"/>
+        <w:spacing w:after="120" w:before="280"/>
+      </w:pPr>
+      <w:r>
+        <w:rPr>
+          <w:rFonts w:ascii="Calibri" w:cs="Calibri" w:eastAsia="Calibri" w:hAnsi="Calibri"/>
+          <w:b/>
+          <w:bCs/>
+          <w:color w:val="131B2E"/>
+          <w:sz w:val="26"/>
+          <w:szCs w:val="26"/>
+        </w:rPr>
+        <w:t xml:space="preserve">10. Dispositions générales</w:t>
       </w:r>
     </w:p>
     <w:p>

</xml_diff>